<commit_message>
Add direct links for thesis appendices
</commit_message>
<xml_diff>
--- a/research/outputs/thesis/20260801/Combat_Cognition_Thesis_I.T.M.S.S.B.Thennakoon.docx
+++ b/research/outputs/thesis/20260801/Combat_Cognition_Thesis_I.T.M.S.S.B.Thennakoon.docx
@@ -13143,6 +13143,32 @@
     </w:p>
     <w:p>
       <w:pPr>
+        <w:spacing w:after="120"/>
+        <w:jc w:val="left"/>
+      </w:pPr>
+      <w:r>
+        <w:rPr>
+          <w:rFonts w:ascii="Times New Roman" w:hAnsi="Times New Roman"/>
+          <w:b/>
+          <w:color w:val="000000"/>
+          <w:sz w:val="24"/>
+        </w:rPr>
+        <w:t xml:space="preserve">Supplementary evidence (A1): </w:t>
+      </w:r>
+      <w:hyperlink r:id="rId11">
+        <w:r>
+          <w:rPr>
+            <w:rFonts w:ascii="Times New Roman" w:hAnsi="Times New Roman"/>
+            <w:sz w:val="24"/>
+            <w:color w:val="0563C1"/>
+            <w:u w:val="single"/>
+          </w:rPr>
+          <w:t>https://github.com/SachithBandaraThennakoon/martial-art-ai/tree/main/research/Appendix/A1-Architecture-and-Implementation</w:t>
+        </w:r>
+      </w:hyperlink>
+    </w:p>
+    <w:p>
+      <w:pPr>
         <w:pStyle w:val="Heading2"/>
         <w:keepNext/>
         <w:widowControl/>
@@ -13197,6 +13223,32 @@
     </w:p>
     <w:p>
       <w:pPr>
+        <w:spacing w:after="120"/>
+        <w:jc w:val="left"/>
+      </w:pPr>
+      <w:r>
+        <w:rPr>
+          <w:rFonts w:ascii="Times New Roman" w:hAnsi="Times New Roman"/>
+          <w:b/>
+          <w:color w:val="000000"/>
+          <w:sz w:val="24"/>
+        </w:rPr>
+        <w:t xml:space="preserve">Supplementary evidence (A2): </w:t>
+      </w:r>
+      <w:hyperlink r:id="rId12">
+        <w:r>
+          <w:rPr>
+            <w:rFonts w:ascii="Times New Roman" w:hAnsi="Times New Roman"/>
+            <w:sz w:val="24"/>
+            <w:color w:val="0563C1"/>
+            <w:u w:val="single"/>
+          </w:rPr>
+          <w:t>https://github.com/SachithBandaraThennakoon/martial-art-ai/tree/main/research/Appendix/A2-ACP-STGAT-Reproducibility</w:t>
+        </w:r>
+      </w:hyperlink>
+    </w:p>
+    <w:p>
+      <w:pPr>
         <w:pStyle w:val="Heading2"/>
         <w:keepNext/>
         <w:widowControl/>
@@ -13251,6 +13303,32 @@
     </w:p>
     <w:p>
       <w:pPr>
+        <w:spacing w:after="120"/>
+        <w:jc w:val="left"/>
+      </w:pPr>
+      <w:r>
+        <w:rPr>
+          <w:rFonts w:ascii="Times New Roman" w:hAnsi="Times New Roman"/>
+          <w:b/>
+          <w:color w:val="000000"/>
+          <w:sz w:val="24"/>
+        </w:rPr>
+        <w:t xml:space="preserve">Supplementary evidence (A3): </w:t>
+      </w:r>
+      <w:hyperlink r:id="rId13">
+        <w:r>
+          <w:rPr>
+            <w:rFonts w:ascii="Times New Roman" w:hAnsi="Times New Roman"/>
+            <w:sz w:val="24"/>
+            <w:color w:val="0563C1"/>
+            <w:u w:val="single"/>
+          </w:rPr>
+          <w:t>https://github.com/SachithBandaraThennakoon/martial-art-ai/tree/main/research/Appendix/A3-Phase-Classifier-Reproducibility</w:t>
+        </w:r>
+      </w:hyperlink>
+    </w:p>
+    <w:p>
+      <w:pPr>
         <w:pStyle w:val="Heading2"/>
         <w:keepNext/>
         <w:widowControl/>
@@ -13288,6 +13366,32 @@
     </w:p>
     <w:p>
       <w:pPr>
+        <w:spacing w:after="120"/>
+        <w:jc w:val="left"/>
+      </w:pPr>
+      <w:r>
+        <w:rPr>
+          <w:rFonts w:ascii="Times New Roman" w:hAnsi="Times New Roman"/>
+          <w:b/>
+          <w:color w:val="000000"/>
+          <w:sz w:val="24"/>
+        </w:rPr>
+        <w:t xml:space="preserve">Supplementary evidence (A4): </w:t>
+      </w:r>
+      <w:hyperlink r:id="rId14">
+        <w:r>
+          <w:rPr>
+            <w:rFonts w:ascii="Times New Roman" w:hAnsi="Times New Roman"/>
+            <w:sz w:val="24"/>
+            <w:color w:val="0563C1"/>
+            <w:u w:val="single"/>
+          </w:rPr>
+          <w:t>https://github.com/SachithBandaraThennakoon/martial-art-ai/tree/main/research/Appendix/A4-Software-Verification</w:t>
+        </w:r>
+      </w:hyperlink>
+    </w:p>
+    <w:p>
+      <w:pPr>
         <w:pStyle w:val="Heading2"/>
         <w:keepNext/>
         <w:widowControl/>
@@ -13325,6 +13429,32 @@
     </w:p>
     <w:p>
       <w:pPr>
+        <w:spacing w:after="120"/>
+        <w:jc w:val="left"/>
+      </w:pPr>
+      <w:r>
+        <w:rPr>
+          <w:rFonts w:ascii="Times New Roman" w:hAnsi="Times New Roman"/>
+          <w:b/>
+          <w:color w:val="000000"/>
+          <w:sz w:val="24"/>
+        </w:rPr>
+        <w:t xml:space="preserve">Supplementary evidence (A5): </w:t>
+      </w:r>
+      <w:hyperlink r:id="rId15">
+        <w:r>
+          <w:rPr>
+            <w:rFonts w:ascii="Times New Roman" w:hAnsi="Times New Roman"/>
+            <w:sz w:val="24"/>
+            <w:color w:val="0563C1"/>
+            <w:u w:val="single"/>
+          </w:rPr>
+          <w:t>https://github.com/SachithBandaraThennakoon/martial-art-ai/tree/main/research/Appendix/A5-P001-Protocol-and-Curated-Evidence</w:t>
+        </w:r>
+      </w:hyperlink>
+    </w:p>
+    <w:p>
+      <w:pPr>
         <w:pStyle w:val="Heading2"/>
         <w:keepNext/>
         <w:widowControl/>
@@ -13379,6 +13509,32 @@
     </w:p>
     <w:p>
       <w:pPr>
+        <w:spacing w:after="120"/>
+        <w:jc w:val="left"/>
+      </w:pPr>
+      <w:r>
+        <w:rPr>
+          <w:rFonts w:ascii="Times New Roman" w:hAnsi="Times New Roman"/>
+          <w:b/>
+          <w:color w:val="000000"/>
+          <w:sz w:val="24"/>
+        </w:rPr>
+        <w:t xml:space="preserve">Supplementary evidence (A6): </w:t>
+      </w:r>
+      <w:hyperlink r:id="rId16">
+        <w:r>
+          <w:rPr>
+            <w:rFonts w:ascii="Times New Roman" w:hAnsi="Times New Roman"/>
+            <w:sz w:val="24"/>
+            <w:color w:val="0563C1"/>
+            <w:u w:val="single"/>
+          </w:rPr>
+          <w:t>https://github.com/SachithBandaraThennakoon/martial-art-ai/tree/main/research/Appendix/A6-Database-Export-and-Failure-Evidence</w:t>
+        </w:r>
+      </w:hyperlink>
+    </w:p>
+    <w:p>
+      <w:pPr>
         <w:pStyle w:val="Heading2"/>
         <w:keepNext/>
         <w:widowControl/>
@@ -13416,6 +13572,32 @@
     </w:p>
     <w:p>
       <w:pPr>
+        <w:spacing w:after="120"/>
+        <w:jc w:val="left"/>
+      </w:pPr>
+      <w:r>
+        <w:rPr>
+          <w:rFonts w:ascii="Times New Roman" w:hAnsi="Times New Roman"/>
+          <w:b/>
+          <w:color w:val="000000"/>
+          <w:sz w:val="24"/>
+        </w:rPr>
+        <w:t xml:space="preserve">Supplementary evidence (A7): </w:t>
+      </w:r>
+      <w:hyperlink r:id="rId17">
+        <w:r>
+          <w:rPr>
+            <w:rFonts w:ascii="Times New Roman" w:hAnsi="Times New Roman"/>
+            <w:sz w:val="24"/>
+            <w:color w:val="0563C1"/>
+            <w:u w:val="single"/>
+          </w:rPr>
+          <w:t>https://github.com/SachithBandaraThennakoon/martial-art-ai/tree/main/research/Appendix/A7-Literature-and-Claim-Audit</w:t>
+        </w:r>
+      </w:hyperlink>
+    </w:p>
+    <w:p>
+      <w:pPr>
         <w:pStyle w:val="Heading2"/>
         <w:keepNext/>
         <w:widowControl/>
@@ -13453,6 +13635,32 @@
     </w:p>
     <w:p>
       <w:pPr>
+        <w:spacing w:after="120"/>
+        <w:jc w:val="left"/>
+      </w:pPr>
+      <w:r>
+        <w:rPr>
+          <w:rFonts w:ascii="Times New Roman" w:hAnsi="Times New Roman"/>
+          <w:b/>
+          <w:color w:val="000000"/>
+          <w:sz w:val="24"/>
+        </w:rPr>
+        <w:t xml:space="preserve">Supplementary evidence (A8): </w:t>
+      </w:r>
+      <w:hyperlink r:id="rId18">
+        <w:r>
+          <w:rPr>
+            <w:rFonts w:ascii="Times New Roman" w:hAnsi="Times New Roman"/>
+            <w:sz w:val="24"/>
+            <w:color w:val="0563C1"/>
+            <w:u w:val="single"/>
+          </w:rPr>
+          <w:t>https://github.com/SachithBandaraThennakoon/martial-art-ai/tree/main/research/Appendix/A8-Evaluation-Actions-and-Evidence-Locks</w:t>
+        </w:r>
+      </w:hyperlink>
+    </w:p>
+    <w:p>
+      <w:pPr>
         <w:pStyle w:val="Heading2"/>
         <w:keepNext/>
         <w:widowControl/>
@@ -13484,21 +13692,27 @@
     </w:p>
     <w:p>
       <w:pPr>
+        <w:spacing w:after="120"/>
         <w:jc w:val="left"/>
       </w:pPr>
       <w:r>
         <w:rPr>
+          <w:rFonts w:ascii="Times New Roman" w:hAnsi="Times New Roman"/>
           <w:b/>
+          <w:color w:val="000000"/>
+          <w:sz w:val="24"/>
         </w:rPr>
-        <w:t xml:space="preserve">Supplementary appendices: </w:t>
+        <w:t xml:space="preserve">Supplementary evidence (A9): </w:t>
       </w:r>
-      <w:hyperlink r:id="rId43">
+      <w:hyperlink r:id="rId19">
         <w:r>
           <w:rPr>
+            <w:rFonts w:ascii="Times New Roman" w:hAnsi="Times New Roman"/>
+            <w:sz w:val="24"/>
             <w:color w:val="0563C1"/>
             <w:u w:val="single"/>
           </w:rPr>
-          <w:t>https://github.com/SachithBandaraThennakoon/martial-art-ai/tree/main/research/Appendix</w:t>
+          <w:t>https://github.com/SachithBandaraThennakoon/martial-art-ai/tree/main/research/Appendix/A9-System-Interface-and-Functional-Evidence</w:t>
         </w:r>
       </w:hyperlink>
     </w:p>

</xml_diff>

<commit_message>
Renumber thesis appendices and evidence links
</commit_message>
<xml_diff>
--- a/research/outputs/thesis/20260801/Combat_Cognition_Thesis_I.T.M.S.S.B.Thennakoon.docx
+++ b/research/outputs/thesis/20260801/Combat_Cognition_Thesis_I.T.M.S.S.B.Thennakoon.docx
@@ -10718,7 +10718,7 @@
           <w:sz w:val="24"/>
           <w:szCs w:val="22"/>
         </w:rPr>
-        <w:t>The wider screenshot set also documents the implemented interaction path across mode selection, dashboard review, Easy and Hard coaching, voice-mediated transitions, practice-set execution, post-session analysis and administrator diagnostics. Representative anonymized frames are preserved in Appendix A9. They establish that these interface states and outputs were displayed during the P001 feasibility case; they do not independently validate the numerical scores, model accuracy, coaching effectiveness or generalizability.</w:t>
+        <w:t>The wider screenshot set also documents the implemented interaction path across mode selection, dashboard review, Easy and Hard coaching, voice-mediated transitions, practice-set execution, post-session analysis and administrator diagnostics. Representative anonymized frames are preserved in Appendix A4. They establish that these interface states and outputs were displayed during the P001 feasibility case; they do not independently validate the numerical scores, model accuracy, coaching effectiveness or generalizability.</w:t>
       </w:r>
     </w:p>
     <w:p>
@@ -13344,7 +13344,7 @@
           <w:sz w:val="24"/>
           <w:szCs w:val="26"/>
         </w:rPr>
-        <w:t>Appendix A4: Software Verification</w:t>
+        <w:t>Appendix A4: System Interface and Functional Evidence</w:t>
       </w:r>
     </w:p>
     <w:p>
@@ -13355,13 +13355,7 @@
         <w:jc w:val="both"/>
       </w:pPr>
       <w:r>
-        <w:rPr>
-          <w:rFonts w:ascii="Times New Roman" w:hAnsi="Times New Roman" w:eastAsia="ＭＳ 明朝" w:cs="Times New Roman" w:eastAsiaTheme="minorEastAsia" w:csTheme="minorBidi"/>
-          <w:color w:val="000000"/>
-          <w:sz w:val="24"/>
-          <w:szCs w:val="22"/>
-        </w:rPr>
-        <w:t>The final evidence consolidation records 129/129 frontend assertions across 23 test files and 24/24 current backend tests. Verification covers checked code paths and contracts; it does not establish live coaching correctness.</w:t>
+        <w:t>The publication-ready supplementary appendix contains account-name-masked screenshots with descriptive filenames. They document visible controls, state transitions and diagnostic outputs in the P001 jab-only laptop-camera case. They are observational implementation evidence, not independent measurements of accuracy, effectiveness, causal reasoning or human-equivalent cognition. To avoid duplicating the same screenshots inside the report, the curated images are provided through the repository link below.</w:t>
       </w:r>
     </w:p>
     <w:p>
@@ -13378,7 +13372,7 @@
         </w:rPr>
         <w:t xml:space="preserve">Supplementary evidence (A4): </w:t>
       </w:r>
-      <w:hyperlink r:id="rId14">
+      <w:hyperlink r:id="rId19">
         <w:r>
           <w:rPr>
             <w:rFonts w:ascii="Times New Roman" w:hAnsi="Times New Roman"/>
@@ -13386,7 +13380,7 @@
             <w:color w:val="0563C1"/>
             <w:u w:val="single"/>
           </w:rPr>
-          <w:t>https://github.com/SachithBandaraThennakoon/martial-art-ai/tree/main/research/Appendix/A4-Software-Verification</w:t>
+          <w:t>https://github.com/SachithBandaraThennakoon/martial-art-ai/tree/main/research/Appendix/A4-System-Interface-and-Functional-Evidence</w:t>
         </w:r>
       </w:hyperlink>
     </w:p>
@@ -13470,7 +13464,70 @@
           <w:sz w:val="24"/>
           <w:szCs w:val="26"/>
         </w:rPr>
-        <w:t>Appendix A6: Database Export and Failure Evidence</w:t>
+        <w:t>Appendix A6: Software Verification</w:t>
+      </w:r>
+    </w:p>
+    <w:p>
+      <w:pPr>
+        <w:widowControl/>
+        <w:spacing w:before="0" w:after="120" w:line="360" w:lineRule="auto"/>
+        <w:ind w:firstLine="432"/>
+        <w:jc w:val="both"/>
+      </w:pPr>
+      <w:r>
+        <w:rPr>
+          <w:rFonts w:ascii="Times New Roman" w:hAnsi="Times New Roman" w:eastAsia="ＭＳ 明朝" w:cs="Times New Roman" w:eastAsiaTheme="minorEastAsia" w:csTheme="minorBidi"/>
+          <w:color w:val="000000"/>
+          <w:sz w:val="24"/>
+          <w:szCs w:val="22"/>
+        </w:rPr>
+        <w:t>The final evidence consolidation records 129/129 frontend assertions across 23 test files and 24/24 current backend tests. Verification covers checked code paths and contracts; it does not establish live coaching correctness.</w:t>
+      </w:r>
+    </w:p>
+    <w:p>
+      <w:pPr>
+        <w:spacing w:after="120"/>
+        <w:jc w:val="left"/>
+      </w:pPr>
+      <w:r>
+        <w:rPr>
+          <w:rFonts w:ascii="Times New Roman" w:hAnsi="Times New Roman"/>
+          <w:b/>
+          <w:color w:val="000000"/>
+          <w:sz w:val="24"/>
+        </w:rPr>
+        <w:t xml:space="preserve">Supplementary evidence (A6): </w:t>
+      </w:r>
+      <w:hyperlink r:id="rId14">
+        <w:r>
+          <w:rPr>
+            <w:rFonts w:ascii="Times New Roman" w:hAnsi="Times New Roman"/>
+            <w:sz w:val="24"/>
+            <w:color w:val="0563C1"/>
+            <w:u w:val="single"/>
+          </w:rPr>
+          <w:t>https://github.com/SachithBandaraThennakoon/martial-art-ai/tree/main/research/Appendix/A6-Software-Verification</w:t>
+        </w:r>
+      </w:hyperlink>
+    </w:p>
+    <w:p>
+      <w:pPr>
+        <w:pStyle w:val="Heading2"/>
+        <w:keepNext/>
+        <w:widowControl/>
+        <w:spacing w:before="200" w:after="120"/>
+        <w:jc w:val="left"/>
+      </w:pPr>
+      <w:r>
+        <w:rPr>
+          <w:rFonts w:ascii="Times New Roman" w:hAnsi="Times New Roman" w:eastAsia="ＭＳ ゴシック" w:cs="Times New Roman" w:eastAsiaTheme="majorEastAsia" w:csTheme="majorBidi"/>
+          <w:b/>
+          <w:bCs/>
+          <w:color w:val="000000"/>
+          <w:sz w:val="24"/>
+          <w:szCs w:val="26"/>
+        </w:rPr>
+        <w:t>Appendix A7: Database Export and Failure Evidence</w:t>
       </w:r>
     </w:p>
     <w:p>
@@ -13519,7 +13576,7 @@
           <w:color w:val="000000"/>
           <w:sz w:val="24"/>
         </w:rPr>
-        <w:t xml:space="preserve">Supplementary evidence (A6): </w:t>
+        <w:t xml:space="preserve">Supplementary evidence (A7): </w:t>
       </w:r>
       <w:hyperlink r:id="rId16">
         <w:r>
@@ -13529,7 +13586,7 @@
             <w:color w:val="0563C1"/>
             <w:u w:val="single"/>
           </w:rPr>
-          <w:t>https://github.com/SachithBandaraThennakoon/martial-art-ai/tree/main/research/Appendix/A6-Database-Export-and-Failure-Evidence</w:t>
+          <w:t>https://github.com/SachithBandaraThennakoon/martial-art-ai/tree/main/research/Appendix/A7-Database-Export-and-Failure-Evidence</w:t>
         </w:r>
       </w:hyperlink>
     </w:p>
@@ -13550,7 +13607,7 @@
           <w:sz w:val="24"/>
           <w:szCs w:val="26"/>
         </w:rPr>
-        <w:t>Appendix A7: Literature and Claim Audit</w:t>
+        <w:t>Appendix A8: Literature and Claim Audit</w:t>
       </w:r>
     </w:p>
     <w:p>
@@ -13582,7 +13639,7 @@
           <w:color w:val="000000"/>
           <w:sz w:val="24"/>
         </w:rPr>
-        <w:t xml:space="preserve">Supplementary evidence (A7): </w:t>
+        <w:t xml:space="preserve">Supplementary evidence (A8): </w:t>
       </w:r>
       <w:hyperlink r:id="rId17">
         <w:r>
@@ -13592,7 +13649,7 @@
             <w:color w:val="0563C1"/>
             <w:u w:val="single"/>
           </w:rPr>
-          <w:t>https://github.com/SachithBandaraThennakoon/martial-art-ai/tree/main/research/Appendix/A7-Literature-and-Claim-Audit</w:t>
+          <w:t>https://github.com/SachithBandaraThennakoon/martial-art-ai/tree/main/research/Appendix/A8-Literature-and-Claim-Audit</w:t>
         </w:r>
       </w:hyperlink>
     </w:p>
@@ -13613,7 +13670,7 @@
           <w:sz w:val="24"/>
           <w:szCs w:val="26"/>
         </w:rPr>
-        <w:t>Appendix A8: Evaluation Actions and Evidence Locks</w:t>
+        <w:t>Appendix A9: Evaluation Actions and Evidence Locks</w:t>
       </w:r>
     </w:p>
     <w:p>
@@ -13645,7 +13702,7 @@
           <w:color w:val="000000"/>
           <w:sz w:val="24"/>
         </w:rPr>
-        <w:t xml:space="preserve">Supplementary evidence (A8): </w:t>
+        <w:t xml:space="preserve">Supplementary evidence (A9): </w:t>
       </w:r>
       <w:hyperlink r:id="rId18">
         <w:r>
@@ -13655,64 +13712,7 @@
             <w:color w:val="0563C1"/>
             <w:u w:val="single"/>
           </w:rPr>
-          <w:t>https://github.com/SachithBandaraThennakoon/martial-art-ai/tree/main/research/Appendix/A8-Evaluation-Actions-and-Evidence-Locks</w:t>
-        </w:r>
-      </w:hyperlink>
-    </w:p>
-    <w:p>
-      <w:pPr>
-        <w:pStyle w:val="Heading2"/>
-        <w:keepNext/>
-        <w:widowControl/>
-        <w:spacing w:before="200" w:after="120"/>
-        <w:jc w:val="left"/>
-      </w:pPr>
-      <w:r>
-        <w:rPr>
-          <w:rFonts w:ascii="Times New Roman" w:hAnsi="Times New Roman" w:eastAsia="ＭＳ ゴシック" w:cs="Times New Roman" w:eastAsiaTheme="majorEastAsia" w:csTheme="majorBidi"/>
-          <w:b/>
-          <w:bCs/>
-          <w:color w:val="000000"/>
-          <w:sz w:val="24"/>
-          <w:szCs w:val="26"/>
-        </w:rPr>
-        <w:t>Appendix A9: System Interface and Functional Evidence</w:t>
-      </w:r>
-    </w:p>
-    <w:p>
-      <w:pPr>
-        <w:widowControl/>
-        <w:spacing w:before="0" w:after="120" w:line="360" w:lineRule="auto"/>
-        <w:ind w:firstLine="432"/>
-        <w:jc w:val="both"/>
-      </w:pPr>
-      <w:r>
-        <w:t>The publication-ready supplementary appendix contains account-name-masked screenshots with descriptive filenames. They document visible controls, state transitions and diagnostic outputs in the P001 jab-only laptop-camera case. They are observational implementation evidence, not independent measurements of accuracy, effectiveness, causal reasoning or human-equivalent cognition. To avoid duplicating the same screenshots inside the report, the curated images are provided through the repository link below.</w:t>
-      </w:r>
-    </w:p>
-    <w:p>
-      <w:pPr>
-        <w:spacing w:after="120"/>
-        <w:jc w:val="left"/>
-      </w:pPr>
-      <w:r>
-        <w:rPr>
-          <w:rFonts w:ascii="Times New Roman" w:hAnsi="Times New Roman"/>
-          <w:b/>
-          <w:color w:val="000000"/>
-          <w:sz w:val="24"/>
-        </w:rPr>
-        <w:t xml:space="preserve">Supplementary evidence (A9): </w:t>
-      </w:r>
-      <w:hyperlink r:id="rId19">
-        <w:r>
-          <w:rPr>
-            <w:rFonts w:ascii="Times New Roman" w:hAnsi="Times New Roman"/>
-            <w:sz w:val="24"/>
-            <w:color w:val="0563C1"/>
-            <w:u w:val="single"/>
-          </w:rPr>
-          <w:t>https://github.com/SachithBandaraThennakoon/martial-art-ai/tree/main/research/Appendix/A9-System-Interface-and-Functional-Evidence</w:t>
+          <w:t>https://github.com/SachithBandaraThennakoon/martial-art-ai/tree/main/research/Appendix/A9-Evaluation-Actions-and-Evidence-Locks</w:t>
         </w:r>
       </w:hyperlink>
     </w:p>

</xml_diff>

<commit_message>
Correct and audit full thesis report
</commit_message>
<xml_diff>
--- a/research/outputs/thesis/20260801/Combat_Cognition_Thesis_I.T.M.S.S.B.Thennakoon.docx
+++ b/research/outputs/thesis/20260801/Combat_Cognition_Thesis_I.T.M.S.S.B.Thennakoon.docx
@@ -217,48 +217,12 @@
         <w:jc w:val="both"/>
       </w:pPr>
       <w:r>
-        <w:rPr>
-          <w:rFonts w:ascii="Times New Roman" w:hAnsi="Times New Roman" w:eastAsia="ＭＳ 明朝" w:cs="Times New Roman" w:eastAsiaTheme="minorEastAsia" w:csTheme="minorBidi"/>
-          <w:color w:val="000000"/>
-          <w:sz w:val="24"/>
-          <w:szCs w:val="22"/>
-        </w:rPr>
-        <w:t>Candidate:I.T.M.S.S.B.Thennakoon</w:t>
-      </w:r>
-      <w:r>
-        <w:br w:type="textWrapping"/>
-      </w:r>
-      <w:r>
-        <w:rPr>
-          <w:rFonts w:ascii="Times New Roman" w:hAnsi="Times New Roman" w:eastAsia="ＭＳ 明朝" w:cs="Times New Roman" w:eastAsiaTheme="minorEastAsia" w:csTheme="minorBidi"/>
-          <w:color w:val="000000"/>
-          <w:sz w:val="24"/>
-          <w:szCs w:val="22"/>
-        </w:rPr>
-        <w:t>Registrationnumber:DTS2401</w:t>
-      </w:r>
-      <w:r>
-        <w:br w:type="textWrapping"/>
-      </w:r>
-      <w:r>
-        <w:rPr>
-          <w:rFonts w:ascii="Times New Roman" w:hAnsi="Times New Roman" w:eastAsia="ＭＳ 明朝" w:cs="Times New Roman" w:eastAsiaTheme="minorEastAsia" w:csTheme="minorBidi"/>
-          <w:color w:val="000000"/>
-          <w:sz w:val="24"/>
-          <w:szCs w:val="22"/>
-        </w:rPr>
-        <w:t>Signature:______________________________</w:t>
-      </w:r>
-      <w:r>
-        <w:br w:type="textWrapping"/>
-      </w:r>
-      <w:r>
-        <w:rPr>
-          <w:rFonts w:ascii="Times New Roman" w:hAnsi="Times New Roman" w:eastAsia="ＭＳ 明朝" w:cs="Times New Roman" w:eastAsiaTheme="minorEastAsia" w:csTheme="minorBidi"/>
-          <w:color w:val="000000"/>
-          <w:sz w:val="24"/>
-          <w:szCs w:val="22"/>
-        </w:rPr>
+        <w:t>Candidate: I.T.M.S.S.B. Thennakoon</w:t>
+        <w:br/>
+        <w:t>Registration number: DTS2401</w:t>
+        <w:br/>
+        <w:t>Signature: ______________________________</w:t>
+        <w:br/>
         <w:t>Date: ______________________________</w:t>
       </w:r>
     </w:p>
@@ -4859,7 +4823,7 @@
           <wp:inline distT="0" distB="0" distL="0" distR="0">
             <wp:extent cx="5534025" cy="3390900"/>
             <wp:effectExtent l="0" t="0" r="0" b="0"/>
-            <wp:docPr id="100000" name="Picture 100000"/>
+            <wp:docPr id="100000" name="Picture 100000" descr="Combat Cognition architecture and evidence flow, showing implemented perception, L1-L4 context, situation-awareness gates, deterministic coaching and the planned non-operational LLM boundary." title="Combat Cognition architecture and evidence flow"/>
             <wp:cNvGraphicFramePr>
               <a:graphicFrameLocks xmlns:a="http://schemas.openxmlformats.org/drawingml/2006/main" noChangeAspect="1"/>
             </wp:cNvGraphicFramePr>
@@ -8032,7 +7996,7 @@
           <wp:inline distT="0" distB="0" distL="0" distR="0">
             <wp:extent cx="5305425" cy="2647950"/>
             <wp:effectExtent l="0" t="0" r="0" b="0"/>
-            <wp:docPr id="100001" name="Picture 100001"/>
+            <wp:docPr id="100001" name="Picture 100001" descr="Line chart comparing normalized ACP-STGAT, last-pose and constant-velocity prediction error across the 30-frame forecast horizon." title="Line chart comparing normalized ACP-STGAT"/>
             <wp:cNvGraphicFramePr>
               <a:graphicFrameLocks xmlns:a="http://schemas.openxmlformats.org/drawingml/2006/main" noChangeAspect="1"/>
             </wp:cNvGraphicFramePr>
@@ -8931,7 +8895,7 @@
           <wp:inline distT="0" distB="0" distL="0" distR="0">
             <wp:extent cx="4848225" cy="3876675"/>
             <wp:effectExtent l="0" t="0" r="0" b="0"/>
-            <wp:docPr id="100002" name="Picture 100002"/>
+            <wp:docPr id="100002" name="Picture 100002" descr="Confusion matrix for the generated-bootstrap temporal phase-classifier evaluation, with generator-defined phase classes." title="Confusion matrix for the generated-bootstrap temporal phase-classifier evaluation"/>
             <wp:cNvGraphicFramePr>
               <a:graphicFrameLocks xmlns:a="http://schemas.openxmlformats.org/drawingml/2006/main" noChangeAspect="1"/>
             </wp:cNvGraphicFramePr>
@@ -10651,7 +10615,7 @@
           <wp:inline distT="0" distB="0" distL="0" distR="0">
             <wp:extent cx="5391150" cy="3552825"/>
             <wp:effectExtent l="0" t="0" r="0" b="0"/>
-            <wp:docPr id="100003" name="Picture 100003"/>
+            <wp:docPr id="100003" name="Picture 100003" descr="Practice-42 post-session timeline showing three completed jab repetition clusters and selected movement phases." title="Practice-42 post-session timeline showing three completed jab repetition clusters and selected movement phases."/>
             <wp:cNvGraphicFramePr>
               <a:graphicFrameLocks xmlns:a="http://schemas.openxmlformats.org/drawingml/2006/main" noChangeAspect="1"/>
             </wp:cNvGraphicFramePr>
@@ -13163,7 +13127,7 @@
             <w:color w:val="0563C1"/>
             <w:u w:val="single"/>
           </w:rPr>
-          <w:t>https://github.com/SachithBandaraThennakoon/martial-art-ai/tree/main/research/Appendix/A1-Architecture-and-Implementation</w:t>
+          <w:t>Open Appendix A1 evidence folder on GitHub</w:t>
         </w:r>
       </w:hyperlink>
     </w:p>
@@ -13243,7 +13207,7 @@
             <w:color w:val="0563C1"/>
             <w:u w:val="single"/>
           </w:rPr>
-          <w:t>https://github.com/SachithBandaraThennakoon/martial-art-ai/tree/main/research/Appendix/A2-ACP-STGAT-Reproducibility</w:t>
+          <w:t>Open Appendix A2 evidence folder on GitHub</w:t>
         </w:r>
       </w:hyperlink>
     </w:p>
@@ -13323,7 +13287,7 @@
             <w:color w:val="0563C1"/>
             <w:u w:val="single"/>
           </w:rPr>
-          <w:t>https://github.com/SachithBandaraThennakoon/martial-art-ai/tree/main/research/Appendix/A3-Phase-Classifier-Reproducibility</w:t>
+          <w:t>Open Appendix A3 evidence folder on GitHub</w:t>
         </w:r>
       </w:hyperlink>
     </w:p>
@@ -13355,7 +13319,7 @@
         <w:jc w:val="both"/>
       </w:pPr>
       <w:r>
-        <w:t>The publication-ready supplementary appendix contains account-name-masked screenshots with descriptive filenames. They document visible controls, state transitions and diagnostic outputs in the P001 jab-only laptop-camera case. They are observational implementation evidence, not independent measurements of accuracy, effectiveness, causal reasoning or human-equivalent cognition. To avoid duplicating the same screenshots inside the report, the curated images are provided through the repository link below.</w:t>
+        <w:t>The publication-ready supplementary appendix contains 51 distinct, account-name-masked screenshots retained after review of all 78 supplied images. They document visible controls, state transitions and diagnostic outputs in the P001 jab-only laptop-camera case. They are observational implementation evidence, not independent measurements of accuracy, effectiveness, causal reasoning or human-equivalent cognition. To avoid duplicating the same screenshots inside the report, the curated images are provided through the repository link below.</w:t>
       </w:r>
     </w:p>
     <w:p>
@@ -13380,7 +13344,7 @@
             <w:color w:val="0563C1"/>
             <w:u w:val="single"/>
           </w:rPr>
-          <w:t>https://github.com/SachithBandaraThennakoon/martial-art-ai/tree/main/research/Appendix/A4-System-Interface-and-Functional-Evidence</w:t>
+          <w:t>Open Appendix A4 evidence folder on GitHub</w:t>
         </w:r>
       </w:hyperlink>
     </w:p>
@@ -13443,7 +13407,7 @@
             <w:color w:val="0563C1"/>
             <w:u w:val="single"/>
           </w:rPr>
-          <w:t>https://github.com/SachithBandaraThennakoon/martial-art-ai/tree/main/research/Appendix/A5-P001-Protocol-and-Curated-Evidence</w:t>
+          <w:t>Open Appendix A5 evidence folder on GitHub</w:t>
         </w:r>
       </w:hyperlink>
     </w:p>
@@ -13506,7 +13470,7 @@
             <w:color w:val="0563C1"/>
             <w:u w:val="single"/>
           </w:rPr>
-          <w:t>https://github.com/SachithBandaraThennakoon/martial-art-ai/tree/main/research/Appendix/A6-Software-Verification</w:t>
+          <w:t>Open Appendix A6 evidence folder on GitHub</w:t>
         </w:r>
       </w:hyperlink>
     </w:p>
@@ -13586,7 +13550,7 @@
             <w:color w:val="0563C1"/>
             <w:u w:val="single"/>
           </w:rPr>
-          <w:t>https://github.com/SachithBandaraThennakoon/martial-art-ai/tree/main/research/Appendix/A7-Database-Export-and-Failure-Evidence</w:t>
+          <w:t>Open Appendix A7 evidence folder on GitHub</w:t>
         </w:r>
       </w:hyperlink>
     </w:p>
@@ -13649,7 +13613,7 @@
             <w:color w:val="0563C1"/>
             <w:u w:val="single"/>
           </w:rPr>
-          <w:t>https://github.com/SachithBandaraThennakoon/martial-art-ai/tree/main/research/Appendix/A8-Literature-and-Claim-Audit</w:t>
+          <w:t>Open Appendix A8 evidence folder on GitHub</w:t>
         </w:r>
       </w:hyperlink>
     </w:p>
@@ -13712,7 +13676,7 @@
             <w:color w:val="0563C1"/>
             <w:u w:val="single"/>
           </w:rPr>
-          <w:t>https://github.com/SachithBandaraThennakoon/martial-art-ai/tree/main/research/Appendix/A9-Evaluation-Actions-and-Evidence-Locks</w:t>
+          <w:t>Open Appendix A9 evidence folder on GitHub</w:t>
         </w:r>
       </w:hyperlink>
     </w:p>

</xml_diff>